<commit_message>
feat: update patent documents and HTML summaries with detailed specifications and enhancements
</commit_message>
<xml_diff>
--- a/patent/docx/01_wsi_viewer_adaptive_tile_streaming.docx
+++ b/patent/docx/01_wsi_viewer_adaptive_tile_streaming.docx
@@ -1251,6 +1251,276 @@
       </w:pPr>
       <w:r>
         <w:t xml:space="preserve">background full tiling과 viewer priority tiling을 하나의 scheduling 체계로 결합한다.</w:t>
+      </w:r>
+    </w:p>
+    <w:p>
+      <w:pPr>
+        <w:pStyle w:val="Heading1"/>
+      </w:pPr>
+      <w:r>
+        <w:t xml:space="preserve">12. 주요 선행 도구 대비 상세 차별성</w:t>
+      </w:r>
+    </w:p>
+    <w:p>
+      <w:r>
+        <w:t xml:space="preserve">아래 비교는 공개 문서상 확인되는 각 도구의 주된 기능 초점과 본 발명의 청구 대상이 되는 Adaptive Tile Streaming 방법의 차이를 정리한 것이다. 최종 출원 전에는 변리사를 통한 선행문헌 검색 및 청구항 보정이 필요하다.</w:t>
+      </w:r>
+    </w:p>
+    <w:p>
+      <w:pPr>
+        <w:pStyle w:val="Heading2"/>
+      </w:pPr>
+      <w:r>
+        <w:t xml:space="preserve">12.1 OpenSeadragon 대비</w:t>
+      </w:r>
+    </w:p>
+    <w:p>
+      <w:r>
+        <w:t xml:space="preserve">OpenSeadragon은 고해상도 zoomable image를 웹에서 표시하기 위한 JavaScript viewer이며, DZI, IIIF, IIP, Zoomify, custom tile source 등 다양한 tile source와 viewport, overlay, multi-image 기능을 제공한다. 즉 OpenSeadragon의 공개 문서상 핵심은 client-side zoom/pan viewer 및 tile source abstraction이다.</w:t>
+      </w:r>
+    </w:p>
+    <w:p>
+      <w:r>
+        <w:t xml:space="preserve">본 발명은 단순히 tile source를 지정하여 이미 존재하는 pyramid tile을 표시하는 것을 넘어, tile이 존재하지 않는 cache miss 상황에서 서버가 해당 tile을 즉시 생성할지 queue에 넣을지를 동적으로 결정한다. 특히 viewer executor queue, inline generation active count, background generation state, tile level, slide format을 이용해 inline generation과 queued generation을 전환한다.</w:t>
+      </w:r>
+    </w:p>
+    <w:p>
+      <w:r>
+        <w:t xml:space="preserve">또한 본 발명은 viewport 변경 시 generation id를 증가시키고 이전 in-flight tile request를 abort하여 stale tile response를 cache에 넣지 않는다. 이는 client viewer의 pan/zoom 처리 자체가 아니라, server-side tile generation scheduling과 client-side stale response 폐기를 결합한 구성이다.</w:t>
+      </w:r>
+    </w:p>
+    <w:p>
+      <w:pPr>
+        <w:pStyle w:val="Heading2"/>
+      </w:pPr>
+      <w:r>
+        <w:t xml:space="preserve">12.2 QuPath 대비</w:t>
+      </w:r>
+    </w:p>
+    <w:p>
+      <w:r>
+        <w:t xml:space="preserve">QuPath는 bioimage analysis를 위한 open-source desktop software로, 복잡한 이미지를 시각화하고 분석하며 annotation을 빠르게 수행하는 기능을 제공한다. 공개 사이트에서도 QuPath는 bioimage analysis, tutorial, annotation, open-source desktop application의 성격이 강조된다.</w:t>
+      </w:r>
+    </w:p>
+    <w:p>
+      <w:r>
+        <w:t xml:space="preserve">본 발명은 desktop application 내부의 image rendering 또는 analysis 기능과 달리, 웹 기반 다중 사용자 서버 환경에서 tile request를 처리한다. 특히 복수 사용자가 서로 다른 viewport를 보고 있을 때, 같은 slide 또는 같은 stage block에 대한 중복 요청을 병합하고, viewport distance, visible intersection, request age, user recency, shared slide count 등을 priority score로 반영한다.</w:t>
+      </w:r>
+    </w:p>
+    <w:p>
+      <w:r>
+        <w:t xml:space="preserve">따라서 차별점은 WSI를 볼 수 있다는 점이 아니라, 다중 접속 SaaS 환경에서 cache miss tile generation을 사용자 체감 우선순위와 서버 부하 조건에 따라 제어한다는 점이다.</w:t>
+      </w:r>
+    </w:p>
+    <w:p>
+      <w:pPr>
+        <w:pStyle w:val="Heading2"/>
+      </w:pPr>
+      <w:r>
+        <w:t xml:space="preserve">12.3 ASAP 대비</w:t>
+      </w:r>
+    </w:p>
+    <w:p>
+      <w:r>
+        <w:t xml:space="preserve">ASAP는 digitized multi-resolution histopathology image를 위한 fast and fluid viewer이며, annotation 도구, segmentation mask 등 algorithm result overlay, OpenSlide 기반 multi-vendor format 지원, mini-map 및 field-of-view tracking을 제공하는 것으로 공개되어 있다.</w:t>
+      </w:r>
+    </w:p>
+    <w:p>
+      <w:r>
+        <w:t xml:space="preserve">본 발명은 fluid viewer 또는 annotation 도구 자체보다, tile generation이 아직 완료되지 않았거나 특수 포맷에서 tile을 즉시 추출해야 하는 상황을 대상으로 한다. cache hit tile은 즉시 응답하고, cache miss tile은 제한 시간 내 inline generation을 시도하되, 서버가 busy 상태이면 priority queue에 등록하고 parent fallback을 유지한다.</w:t>
+      </w:r>
+    </w:p>
+    <w:p>
+      <w:r>
+        <w:t xml:space="preserve">또한 본 발명은 background full tiling이 진행 중인 slide에서도 현재 viewport tile을 priority set에 등록하여 full tiling 순서보다 먼저 생성되게 한다. ASAP의 공개 기능 설명에서 확인되는 fast viewing 또는 annotation과 달리, 본 발명은 background tiling과 viewer on-demand tiling을 하나의 adaptive scheduling 정책으로 결합한다.</w:t>
+      </w:r>
+    </w:p>
+    <w:p>
+      <w:pPr>
+        <w:pStyle w:val="Heading2"/>
+      </w:pPr>
+      <w:r>
+        <w:t xml:space="preserve">12.4 PathPresenter 등 상용 digital pathology viewer 대비</w:t>
+      </w:r>
+    </w:p>
+    <w:p>
+      <w:r>
+        <w:t xml:space="preserve">PathPresenter는 image management system, clinical viewer, consultation, education, biorepository, vendor-agnostic integration, AI readiness, simultaneous users 환경에서의 rendering speed 등을 강조하는 상용 digital pathology platform이다.</w:t>
+      </w:r>
+    </w:p>
+    <w:p>
+      <w:r>
+        <w:t xml:space="preserve">본 발명은 상용 viewer의 고속 rendering 또는 IMS 기능 일반을 청구하려는 것이 아니라, 고속 rendering을 달성하기 위한 구체적인 tile miss 처리 정책을 청구 대상으로 한다. 즉 서버가 현재 tile request를 처리할 때 inline active count, viewer queue length, tile level별 timeout, special format bridge latency, background generation status를 평가하여 inline generation, queued generation, parent fallback, retry response 중 하나를 선택하는 구체적 제어 절차가 핵심이다.</w:t>
+      </w:r>
+    </w:p>
+    <w:p>
+      <w:r>
+        <w:t xml:space="preserve">또한 multi-user 환경에서 사용자별 viewport request를 priority queue로 병합하고, 중복 stage block 요청을 제거하며, wait age를 score에 반영하여 특정 사용자의 요청이 장시간 밀리지 않도록 하는 starvation 방지 구성을 포함한다.</w:t>
+      </w:r>
+    </w:p>
+    <w:p>
+      <w:pPr>
+        <w:pStyle w:val="Heading2"/>
+      </w:pPr>
+      <w:r>
+        <w:t xml:space="preserve">12.5 일반 digital pathology viewer 대비</w:t>
+      </w:r>
+    </w:p>
+    <w:p>
+      <w:r>
+        <w:t xml:space="preserve">일반적인 digital pathology viewer는 tile pyramid를 사전에 생성하거나 scanner/vendor format의 기존 pyramid level을 읽어 화면에 표시한다. 이러한 방식은 tile이 이미 존재하는 경우에는 빠르지만, cache miss, on-demand conversion, 특수 포맷 bridge extraction, background tiling과 viewer request가 동시에 발생하는 상황에서는 HTTP 요청이 장시간 blocking될 수 있다.</w:t>
+      </w:r>
+    </w:p>
+    <w:p>
+      <w:r>
+        <w:t xml:space="preserve">본 발명은 다음의 결합 구조를 통해 차별화된다.</w:t>
+      </w:r>
+    </w:p>
+    <w:p>
+      <w:pPr>
+        <w:numPr>
+          <w:ilvl w:val="0"/>
+          <w:numId w:val="1"/>
+        </w:numPr>
+      </w:pPr>
+      <w:r>
+        <w:t xml:space="preserve">cache marker 및 source signature를 이용한 빠른 cache validity 판단</w:t>
+      </w:r>
+    </w:p>
+    <w:p>
+      <w:pPr>
+        <w:numPr>
+          <w:ilvl w:val="0"/>
+          <w:numId w:val="1"/>
+        </w:numPr>
+      </w:pPr>
+      <w:r>
+        <w:t xml:space="preserve">cache miss tile에 대한 inline generation 허용 조건식</w:t>
+      </w:r>
+    </w:p>
+    <w:p>
+      <w:pPr>
+        <w:numPr>
+          <w:ilvl w:val="0"/>
+          <w:numId w:val="1"/>
+        </w:numPr>
+      </w:pPr>
+      <w:r>
+        <w:t xml:space="preserve">tile level 및 special format별 timeout</w:t>
+      </w:r>
+    </w:p>
+    <w:p>
+      <w:pPr>
+        <w:numPr>
+          <w:ilvl w:val="0"/>
+          <w:numId w:val="1"/>
+        </w:numPr>
+      </w:pPr>
+      <w:r>
+        <w:t xml:space="preserve">busy 상태에서 queued response와 parent fallback을 이용하는 non-blocking UX</w:t>
+      </w:r>
+    </w:p>
+    <w:p>
+      <w:pPr>
+        <w:numPr>
+          <w:ilvl w:val="0"/>
+          <w:numId w:val="1"/>
+        </w:numPr>
+      </w:pPr>
+      <w:r>
+        <w:t xml:space="preserve">현재 viewport tile을 background full tiling보다 우선 처리하는 priority scheduling</w:t>
+      </w:r>
+    </w:p>
+    <w:p>
+      <w:pPr>
+        <w:numPr>
+          <w:ilvl w:val="0"/>
+          <w:numId w:val="1"/>
+        </w:numPr>
+      </w:pPr>
+      <w:r>
+        <w:t xml:space="preserve">generation id를 이용한 stale tile response 폐기</w:t>
+      </w:r>
+    </w:p>
+    <w:p>
+      <w:pPr>
+        <w:numPr>
+          <w:ilvl w:val="0"/>
+          <w:numId w:val="1"/>
+        </w:numPr>
+      </w:pPr>
+      <w:r>
+        <w:t xml:space="preserve">multi-user request 병합 및 starvation 방지 priority score</w:t>
+      </w:r>
+    </w:p>
+    <w:p>
+      <w:r>
+        <w:t xml:space="preserve">따라서 본 발명의 차별성은 "WSI를 타일로 보여준다"가 아니라, "타일이 없거나 생성 중인 상황에서 다중 사용자 웹 서버가 어떤 타일을 언제, 어떤 방식으로 생성하고, 사용자는 어떤 fallback을 보면서 끊김 없이 탐색하는가"에 있다.</w:t>
+      </w:r>
+    </w:p>
+    <w:p>
+      <w:pPr>
+        <w:pStyle w:val="Heading2"/>
+      </w:pPr>
+      <w:r>
+        <w:t xml:space="preserve">12.6 변리사 검토용 차별성 한 줄 요약</w:t>
+      </w:r>
+    </w:p>
+    <w:p>
+      <w:r>
+        <w:t xml:space="preserve">본 발명은 기존 WSI viewer의 tile display 또는 annotation 기능이 아니라, cache miss 및 background generation이 발생하는 SaaS형 다중 사용자 WSI viewer에서 server load, tile level, slide format, viewport priority, generation id를 결합하여 inline tile generation과 queued tile generation을 adaptive하게 전환하는 구체적 streaming control 방법이다.</w:t>
+      </w:r>
+    </w:p>
+    <w:p>
+      <w:pPr>
+        <w:pStyle w:val="Heading2"/>
+      </w:pPr>
+      <w:r>
+        <w:t xml:space="preserve">12.7 참고 공개 자료</w:t>
+      </w:r>
+    </w:p>
+    <w:p>
+      <w:pPr>
+        <w:numPr>
+          <w:ilvl w:val="0"/>
+          <w:numId w:val="1"/>
+        </w:numPr>
+      </w:pPr>
+      <w:r>
+        <w:t xml:space="preserve">OpenSeadragon 공식 사이트: open-source web-based viewer for high-resolution zoomable images, supported tile sources, overlay and viewport 기능</w:t>
+      </w:r>
+    </w:p>
+    <w:p>
+      <w:pPr>
+        <w:numPr>
+          <w:ilvl w:val="0"/>
+          <w:numId w:val="1"/>
+        </w:numPr>
+      </w:pPr>
+      <w:r>
+        <w:t xml:space="preserve">QuPath 공식 사이트: open software for bioimage analysis, visualization, annotation, analysis workflow</w:t>
+      </w:r>
+    </w:p>
+    <w:p>
+      <w:pPr>
+        <w:numPr>
+          <w:ilvl w:val="0"/>
+          <w:numId w:val="1"/>
+        </w:numPr>
+      </w:pPr>
+      <w:r>
+        <w:t xml:space="preserve">ASAP 공식 사이트: fast and fluid viewer for digitized multi-resolution histopathology images, annotation tools, algorithm result overlay</w:t>
+      </w:r>
+    </w:p>
+    <w:p>
+      <w:pPr>
+        <w:numPr>
+          <w:ilvl w:val="0"/>
+          <w:numId w:val="1"/>
+        </w:numPr>
+      </w:pPr>
+      <w:r>
+        <w:t xml:space="preserve">PathPresenter 공식 사이트: comprehensive digital pathology image management system, clinical viewer, high simultaneous-user rendering speed, vendor-agnostic integration</w:t>
       </w:r>
     </w:p>
     <w:sectPr>

</xml_diff>